<commit_message>
docs: add Company Dash and maintain beginner manuals
</commit_message>
<xml_diff>
--- a/docs/beginner-guides/chapters/02 Nexora platform setup and VS Code.docx
+++ b/docs/beginner-guides/chapters/02 Nexora platform setup and VS Code.docx
@@ -22,7 +22,7 @@
     <w:p>
       <w:pPr/>
       <w:r>
-        <w:t>Source snapshot 13 October 2026 at 17:12 UTC</w:t>
+        <w:t>Source snapshot 14 October 2026 at 06:41 UTC</w:t>
       </w:r>
     </w:p>
     <w:p>
@@ -350,7 +350,7 @@
               <w:pStyle w:val="TableBody"/>
             </w:pPr>
             <w:r>
-              <w:t>S0575 Program.cs</w:t>
+              <w:t>S0576 Program.cs</w:t>
             </w:r>
           </w:p>
         </w:tc>
@@ -415,7 +415,7 @@
               <w:pStyle w:val="TableBody"/>
             </w:pPr>
             <w:r>
-              <w:t>S0185 Nexora.slnx</w:t>
+              <w:t>S0186 Nexora.slnx</w:t>
             </w:r>
           </w:p>
         </w:tc>
@@ -478,7 +478,7 @@
         <w:rPr>
           <w:b/>
         </w:rPr>
-        <w:t>Server S0575</w:t>
+        <w:t>Server S0576</w:t>
       </w:r>
     </w:p>
     <w:p>
@@ -501,7 +501,7 @@
         <w:rPr>
           <w:b/>
         </w:rPr>
-        <w:t>Projects S0185</w:t>
+        <w:t>Projects S0186</w:t>
       </w:r>
     </w:p>
     <w:p>
@@ -570,7 +570,7 @@
     <w:p>
       <w:pPr/>
       <w:r>
-        <w:t>Nexora uses one Next.js web project and a C# backend made of modules. The three local frontend processes share source but have separate debug outputs. A .tsx file draws a screen, .css changes appearance, .cs runs server rules, and .json supplies configuration. Company Dash appears in the launch menu but belongs to a separate repository; its source is outside this manual.</w:t>
+        <w:t>Nexora uses one Next.js web project and a C# backend made of modules. The three local frontend processes share source but have separate debug outputs. A .tsx file draws a screen, .css changes appearance, .cs runs server rules, and .json supplies configuration. Company Dash appears in the launch menu and belongs to a separate repository; guides 31 to 36 and the company-dash source entries cover it in this manual.</w:t>
       </w:r>
     </w:p>
     <w:p>
@@ -658,7 +658,7 @@
         <w:keepNext/>
       </w:pPr>
       <w:r>
-        <w:t>Source reference S0575 backend/src/Nexora.Api/Program.cs</w:t>
+        <w:t>Source reference S0576 backend/src/Nexora.Api/Program.cs</w:t>
       </w:r>
     </w:p>
     <w:p>
@@ -693,7 +693,7 @@
         <w:keepNext/>
       </w:pPr>
       <w:r>
-        <w:t>Source reference S0185 backend/Nexora.slnx</w:t>
+        <w:t>Source reference S0186 backend/Nexora.slnx</w:t>
       </w:r>
     </w:p>
     <w:p>

</xml_diff>